<commit_message>
Atualização do portfólio EC — 11/10/2026 13:16:56
</commit_message>
<xml_diff>
--- a/docs/EC-WebDev-Identidade-Visual.docx
+++ b/docs/EC-WebDev-Identidade-Visual.docx
@@ -7,12 +7,48 @@
         <w:pStyle w:val="Title"/>
       </w:pPr>
       <w:r>
-        <w:t>EC WebDev — Guia de Identidade Visual</w:t>
+        <w:t>Guia de identidade visual EC Criações</w:t>
       </w:r>
     </w:p>
     <w:p>
       <w:r>
-        <w:t>Versão 15 · Guia + laboratório de direção visual</w:t>
+        <w:t>Marca EC atualizada em outubro de 2026</w:t>
+      </w:r>
+    </w:p>
+    <w:p>
+      <w:r>
+        <w:drawing>
+          <wp:inline xmlns:a="http://schemas.openxmlformats.org/drawingml/2006/main" xmlns:pic="http://schemas.openxmlformats.org/drawingml/2006/picture">
+            <wp:extent cx="1097280" cy="731520"/>
+            <wp:docPr id="1" name="Picture 1"/>
+            <wp:cNvGraphicFramePr>
+              <a:graphicFrameLocks noChangeAspect="1"/>
+            </wp:cNvGraphicFramePr>
+            <a:graphic>
+              <a:graphicData uri="http://schemas.openxmlformats.org/drawingml/2006/picture">
+                <pic:pic>
+                  <pic:nvPicPr>
+                    <pic:cNvPr id="0" name="EC-simbolo.png"/>
+                    <pic:cNvPicPr/>
+                  </pic:nvPicPr>
+                  <pic:blipFill>
+                    <a:blip r:embed="rId9"/>
+                    <a:stretch>
+                      <a:fillRect/>
+                    </a:stretch>
+                  </pic:blipFill>
+                  <pic:spPr>
+                    <a:xfrm>
+                      <a:off x="0" y="0"/>
+                      <a:ext cx="1097280" cy="731520"/>
+                    </a:xfrm>
+                    <a:prstGeom prst="rect"/>
+                  </pic:spPr>
+                </pic:pic>
+              </a:graphicData>
+            </a:graphic>
+          </wp:inline>
+        </w:drawing>
       </w:r>
     </w:p>
     <w:p>
@@ -25,7 +61,7 @@
     </w:p>
     <w:p>
       <w:r>
-        <w:t>Este guia documenta a identidade visual atual da EC WebDev e organiza opções que podem ser usadas como ponto de partida em futuros projetos de desenvolvimento web.</w:t>
+        <w:t>Este guia documenta a identidade visual atual da EC Criações e organiza opções que podem ser usadas como ponto de partida em futuros projetos de desenvolvimento web.</w:t>
       </w:r>
     </w:p>
     <w:p>
@@ -150,6 +186,7 @@
     <w:p>
       <w:pPr>
         <w:pStyle w:val="Heading1"/>
+        <w:keepNext/>
       </w:pPr>
       <w:r>
         <w:t>5. Componentes</w:t>
@@ -158,6 +195,7 @@
     <w:p>
       <w:pPr>
         <w:pStyle w:val="ListBullet"/>
+        <w:keepNext/>
       </w:pPr>
       <w:r>
         <w:t>CTA primário e secundário</w:t>
@@ -166,6 +204,7 @@
     <w:p>
       <w:pPr>
         <w:pStyle w:val="ListBullet"/>
+        <w:keepNext/>
       </w:pPr>
       <w:r>
         <w:t>Cards e badges</w:t>
@@ -174,6 +213,7 @@
     <w:p>
       <w:pPr>
         <w:pStyle w:val="ListBullet"/>
+        <w:keepNext/>
       </w:pPr>
       <w:r>
         <w:t>Bordas e raios consistentes</w:t>
@@ -182,6 +222,7 @@
     <w:p>
       <w:pPr>
         <w:pStyle w:val="ListBullet"/>
+        <w:keepNext/>
       </w:pPr>
       <w:r>
         <w:t>Ícones simples</w:t>
@@ -190,6 +231,7 @@
     <w:p>
       <w:pPr>
         <w:pStyle w:val="ListBullet"/>
+        <w:keepNext/>
       </w:pPr>
       <w:r>
         <w:t>Imagens com molduras discretas</w:t>
@@ -761,7 +803,7 @@
       <w:rFonts w:asciiTheme="majorHAnsi" w:eastAsiaTheme="majorEastAsia" w:hAnsiTheme="majorHAnsi" w:cstheme="majorBidi"/>
       <w:b/>
       <w:bCs/>
-      <w:color w:val="365F91" w:themeColor="accent1" w:themeShade="BF"/>
+      <w:color w:val="000000"/>
       <w:sz w:val="28"/>
       <w:szCs w:val="28"/>
     </w:rPr>
@@ -785,7 +827,7 @@
       <w:rFonts w:asciiTheme="majorHAnsi" w:eastAsiaTheme="majorEastAsia" w:hAnsiTheme="majorHAnsi" w:cstheme="majorBidi"/>
       <w:b/>
       <w:bCs/>
-      <w:color w:val="4F81BD" w:themeColor="accent1"/>
+      <w:color w:val="000000"/>
       <w:sz w:val="26"/>
       <w:szCs w:val="26"/>
     </w:rPr>
@@ -809,7 +851,7 @@
       <w:rFonts w:asciiTheme="majorHAnsi" w:eastAsiaTheme="majorEastAsia" w:hAnsiTheme="majorHAnsi" w:cstheme="majorBidi"/>
       <w:b/>
       <w:bCs/>
-      <w:color w:val="4F81BD" w:themeColor="accent1"/>
+      <w:color w:val="000000"/>
     </w:rPr>
   </w:style>
   <w:style w:type="paragraph" w:styleId="Heading4">
@@ -1040,15 +1082,12 @@
     <w:qFormat/>
     <w:rsid w:val="00FC693F"/>
     <w:pPr>
-      <w:pBdr>
-        <w:bottom w:val="single" w:sz="8" w:space="4" w:color="4F81BD" w:themeColor="accent1"/>
-      </w:pBdr>
       <w:spacing w:after="300" w:line="240" w:lineRule="auto"/>
       <w:contextualSpacing/>
     </w:pPr>
     <w:rPr>
       <w:rFonts w:asciiTheme="majorHAnsi" w:eastAsiaTheme="majorEastAsia" w:hAnsiTheme="majorHAnsi" w:cstheme="majorBidi"/>
-      <w:color w:val="17365D" w:themeColor="text2" w:themeShade="BF"/>
+      <w:color w:val="000000"/>
       <w:spacing w:val="5"/>
       <w:kern w:val="28"/>
       <w:sz w:val="52"/>
@@ -1527,9 +1566,6 @@
     <w:qFormat/>
     <w:rsid w:val="00FC693F"/>
     <w:pPr>
-      <w:pBdr>
-        <w:bottom w:val="single" w:sz="4" w:space="4" w:color="4F81BD" w:themeColor="accent1"/>
-      </w:pBdr>
       <w:spacing w:before="200" w:after="280"/>
       <w:ind w:left="936" w:right="936"/>
     </w:pPr>

</xml_diff>